<commit_message>
State in the closing report that Claude Code assisted the work
Adds a note under the title and a short section listing what was done
with the tool and which decisions were the author's.

TR: Kapanış raporuna Claude Code yardımıyla hazırlandığı belirtildi.
</commit_message>
<xml_diff>
--- a/docs/kapanis_raporu.docx
+++ b/docs/kapanis_raporu.docx
@@ -28,14 +28,14 @@
         <w:rPr>
           <w:i/>
         </w:rPr>
-        <w:t>)</w:t>
+        <w:t>) · Claude Code yardımıyla hazırlanmıştır (Bölüm 11).</w:t>
       </w:r>
     </w:p>
     <w:p>
       <w:pPr>
         <w:pStyle w:val="Balk1"/>
       </w:pPr>
-      <w:bookmarkStart w:id="0" w:name="_Toc242809754"/>
+      <w:bookmarkStart w:id="0" w:name="_Toc242821070"/>
       <w:r>
         <w:t>İçindekiler</w:t>
       </w:r>
@@ -66,7 +66,7 @@
       <w:r>
         <w:fldChar w:fldCharType="separate"/>
       </w:r>
-      <w:hyperlink w:anchor="_Toc242809754" w:history="1">
+      <w:hyperlink w:anchor="_Toc242821070" w:history="1">
         <w:r>
           <w:rPr>
             <w:rStyle w:val="Kpr"/>
@@ -93,7 +93,7 @@
             <w:noProof/>
             <w:webHidden/>
           </w:rPr>
-          <w:instrText xml:space="preserve"> PAGEREF _Toc242809754 \h </w:instrText>
+          <w:instrText xml:space="preserve"> PAGEREF _Toc242821070 \h </w:instrText>
         </w:r>
         <w:r>
           <w:rPr>
@@ -140,7 +140,7 @@
           <w14:ligatures w14:val="standardContextual"/>
         </w:rPr>
       </w:pPr>
-      <w:hyperlink w:anchor="_Toc242809755" w:history="1">
+      <w:hyperlink w:anchor="_Toc242821071" w:history="1">
         <w:r>
           <w:rPr>
             <w:rStyle w:val="Kpr"/>
@@ -167,7 +167,7 @@
             <w:noProof/>
             <w:webHidden/>
           </w:rPr>
-          <w:instrText xml:space="preserve"> PAGEREF _Toc242809755 \h </w:instrText>
+          <w:instrText xml:space="preserve"> PAGEREF _Toc242821071 \h </w:instrText>
         </w:r>
         <w:r>
           <w:rPr>
@@ -214,7 +214,7 @@
           <w14:ligatures w14:val="standardContextual"/>
         </w:rPr>
       </w:pPr>
-      <w:hyperlink w:anchor="_Toc242809756" w:history="1">
+      <w:hyperlink w:anchor="_Toc242821072" w:history="1">
         <w:r>
           <w:rPr>
             <w:rStyle w:val="Kpr"/>
@@ -241,7 +241,7 @@
             <w:noProof/>
             <w:webHidden/>
           </w:rPr>
-          <w:instrText xml:space="preserve"> PAGEREF _Toc242809756 \h </w:instrText>
+          <w:instrText xml:space="preserve"> PAGEREF _Toc242821072 \h </w:instrText>
         </w:r>
         <w:r>
           <w:rPr>
@@ -288,7 +288,7 @@
           <w14:ligatures w14:val="standardContextual"/>
         </w:rPr>
       </w:pPr>
-      <w:hyperlink w:anchor="_Toc242809757" w:history="1">
+      <w:hyperlink w:anchor="_Toc242821073" w:history="1">
         <w:r>
           <w:rPr>
             <w:rStyle w:val="Kpr"/>
@@ -315,7 +315,7 @@
             <w:noProof/>
             <w:webHidden/>
           </w:rPr>
-          <w:instrText xml:space="preserve"> PAGEREF _Toc242809757 \h </w:instrText>
+          <w:instrText xml:space="preserve"> PAGEREF _Toc242821073 \h </w:instrText>
         </w:r>
         <w:r>
           <w:rPr>
@@ -362,7 +362,7 @@
           <w14:ligatures w14:val="standardContextual"/>
         </w:rPr>
       </w:pPr>
-      <w:hyperlink w:anchor="_Toc242809758" w:history="1">
+      <w:hyperlink w:anchor="_Toc242821074" w:history="1">
         <w:r>
           <w:rPr>
             <w:rStyle w:val="Kpr"/>
@@ -389,7 +389,7 @@
             <w:noProof/>
             <w:webHidden/>
           </w:rPr>
-          <w:instrText xml:space="preserve"> PAGEREF _Toc242809758 \h </w:instrText>
+          <w:instrText xml:space="preserve"> PAGEREF _Toc242821074 \h </w:instrText>
         </w:r>
         <w:r>
           <w:rPr>
@@ -436,7 +436,7 @@
           <w14:ligatures w14:val="standardContextual"/>
         </w:rPr>
       </w:pPr>
-      <w:hyperlink w:anchor="_Toc242809759" w:history="1">
+      <w:hyperlink w:anchor="_Toc242821075" w:history="1">
         <w:r>
           <w:rPr>
             <w:rStyle w:val="Kpr"/>
@@ -463,7 +463,7 @@
             <w:noProof/>
             <w:webHidden/>
           </w:rPr>
-          <w:instrText xml:space="preserve"> PAGEREF _Toc242809759 \h </w:instrText>
+          <w:instrText xml:space="preserve"> PAGEREF _Toc242821075 \h </w:instrText>
         </w:r>
         <w:r>
           <w:rPr>
@@ -510,7 +510,7 @@
           <w14:ligatures w14:val="standardContextual"/>
         </w:rPr>
       </w:pPr>
-      <w:hyperlink w:anchor="_Toc242809760" w:history="1">
+      <w:hyperlink w:anchor="_Toc242821076" w:history="1">
         <w:r>
           <w:rPr>
             <w:rStyle w:val="Kpr"/>
@@ -537,7 +537,7 @@
             <w:noProof/>
             <w:webHidden/>
           </w:rPr>
-          <w:instrText xml:space="preserve"> PAGEREF _Toc242809760 \h </w:instrText>
+          <w:instrText xml:space="preserve"> PAGEREF _Toc242821076 \h </w:instrText>
         </w:r>
         <w:r>
           <w:rPr>
@@ -584,7 +584,7 @@
           <w14:ligatures w14:val="standardContextual"/>
         </w:rPr>
       </w:pPr>
-      <w:hyperlink w:anchor="_Toc242809761" w:history="1">
+      <w:hyperlink w:anchor="_Toc242821077" w:history="1">
         <w:r>
           <w:rPr>
             <w:rStyle w:val="Kpr"/>
@@ -611,7 +611,7 @@
             <w:noProof/>
             <w:webHidden/>
           </w:rPr>
-          <w:instrText xml:space="preserve"> PAGEREF _Toc242809761 \h </w:instrText>
+          <w:instrText xml:space="preserve"> PAGEREF _Toc242821077 \h </w:instrText>
         </w:r>
         <w:r>
           <w:rPr>
@@ -658,7 +658,7 @@
           <w14:ligatures w14:val="standardContextual"/>
         </w:rPr>
       </w:pPr>
-      <w:hyperlink w:anchor="_Toc242809762" w:history="1">
+      <w:hyperlink w:anchor="_Toc242821078" w:history="1">
         <w:r>
           <w:rPr>
             <w:rStyle w:val="Kpr"/>
@@ -685,7 +685,7 @@
             <w:noProof/>
             <w:webHidden/>
           </w:rPr>
-          <w:instrText xml:space="preserve"> PAGEREF _Toc242809762 \h </w:instrText>
+          <w:instrText xml:space="preserve"> PAGEREF _Toc242821078 \h </w:instrText>
         </w:r>
         <w:r>
           <w:rPr>
@@ -732,7 +732,7 @@
           <w14:ligatures w14:val="standardContextual"/>
         </w:rPr>
       </w:pPr>
-      <w:hyperlink w:anchor="_Toc242809763" w:history="1">
+      <w:hyperlink w:anchor="_Toc242821079" w:history="1">
         <w:r>
           <w:rPr>
             <w:rStyle w:val="Kpr"/>
@@ -759,7 +759,7 @@
             <w:noProof/>
             <w:webHidden/>
           </w:rPr>
-          <w:instrText xml:space="preserve"> PAGEREF _Toc242809763 \h </w:instrText>
+          <w:instrText xml:space="preserve"> PAGEREF _Toc242821079 \h </w:instrText>
         </w:r>
         <w:r>
           <w:rPr>
@@ -806,7 +806,7 @@
           <w14:ligatures w14:val="standardContextual"/>
         </w:rPr>
       </w:pPr>
-      <w:hyperlink w:anchor="_Toc242809764" w:history="1">
+      <w:hyperlink w:anchor="_Toc242821080" w:history="1">
         <w:r>
           <w:rPr>
             <w:rStyle w:val="Kpr"/>
@@ -833,7 +833,7 @@
             <w:noProof/>
             <w:webHidden/>
           </w:rPr>
-          <w:instrText xml:space="preserve"> PAGEREF _Toc242809764 \h </w:instrText>
+          <w:instrText xml:space="preserve"> PAGEREF _Toc242821080 \h </w:instrText>
         </w:r>
         <w:r>
           <w:rPr>
@@ -880,13 +880,13 @@
           <w14:ligatures w14:val="standardContextual"/>
         </w:rPr>
       </w:pPr>
-      <w:hyperlink w:anchor="_Toc242809765" w:history="1">
+      <w:hyperlink w:anchor="_Toc242821081" w:history="1">
         <w:r>
           <w:rPr>
             <w:rStyle w:val="Kpr"/>
             <w:noProof/>
           </w:rPr>
-          <w:t>Kaynaklar</w:t>
+          <w:t>11. Yapay zekâ yardımı beyanı</w:t>
         </w:r>
         <w:r>
           <w:rPr>
@@ -907,7 +907,7 @@
             <w:noProof/>
             <w:webHidden/>
           </w:rPr>
-          <w:instrText xml:space="preserve"> PAGEREF _Toc242809765 \h </w:instrText>
+          <w:instrText xml:space="preserve"> PAGEREF _Toc242821081 \h </w:instrText>
         </w:r>
         <w:r>
           <w:rPr>
@@ -939,6 +939,80 @@
       </w:hyperlink>
     </w:p>
     <w:p>
+      <w:pPr>
+        <w:pStyle w:val="T2"/>
+        <w:tabs>
+          <w:tab w:val="right" w:leader="dot" w:pos="9736"/>
+        </w:tabs>
+        <w:rPr>
+          <w:rFonts w:asciiTheme="minorHAnsi" w:eastAsiaTheme="minorEastAsia" w:hAnsiTheme="minorHAnsi" w:cstheme="minorBidi"/>
+          <w:noProof/>
+          <w:kern w:val="2"/>
+          <w:sz w:val="24"/>
+          <w:szCs w:val="24"/>
+          <w:lang w:val="tr-TR" w:eastAsia="tr-TR"/>
+          <w14:ligatures w14:val="standardContextual"/>
+        </w:rPr>
+      </w:pPr>
+      <w:hyperlink w:anchor="_Toc242821082" w:history="1">
+        <w:r>
+          <w:rPr>
+            <w:rStyle w:val="Kpr"/>
+            <w:noProof/>
+          </w:rPr>
+          <w:t>Kaynaklar</w:t>
+        </w:r>
+        <w:r>
+          <w:rPr>
+            <w:noProof/>
+            <w:webHidden/>
+          </w:rPr>
+          <w:tab/>
+        </w:r>
+        <w:r>
+          <w:rPr>
+            <w:noProof/>
+            <w:webHidden/>
+          </w:rPr>
+          <w:fldChar w:fldCharType="begin"/>
+        </w:r>
+        <w:r>
+          <w:rPr>
+            <w:noProof/>
+            <w:webHidden/>
+          </w:rPr>
+          <w:instrText xml:space="preserve"> PAGEREF _Toc242821082 \h </w:instrText>
+        </w:r>
+        <w:r>
+          <w:rPr>
+            <w:noProof/>
+            <w:webHidden/>
+          </w:rPr>
+        </w:r>
+        <w:r>
+          <w:rPr>
+            <w:noProof/>
+            <w:webHidden/>
+          </w:rPr>
+          <w:fldChar w:fldCharType="separate"/>
+        </w:r>
+        <w:r>
+          <w:rPr>
+            <w:noProof/>
+            <w:webHidden/>
+          </w:rPr>
+          <w:t>9</w:t>
+        </w:r>
+        <w:r>
+          <w:rPr>
+            <w:noProof/>
+            <w:webHidden/>
+          </w:rPr>
+          <w:fldChar w:fldCharType="end"/>
+        </w:r>
+      </w:hyperlink>
+    </w:p>
+    <w:p>
       <w:r>
         <w:fldChar w:fldCharType="end"/>
       </w:r>
@@ -952,7 +1026,7 @@
       <w:pPr>
         <w:pStyle w:val="Balk2"/>
       </w:pPr>
-      <w:bookmarkStart w:id="1" w:name="_Toc242809755"/>
+      <w:bookmarkStart w:id="1" w:name="_Toc242821071"/>
       <w:r>
         <w:lastRenderedPageBreak/>
         <w:t>1. Özet</w:t>
@@ -1048,7 +1122,7 @@
       <w:pPr>
         <w:pStyle w:val="Balk2"/>
       </w:pPr>
-      <w:bookmarkStart w:id="2" w:name="_Toc242809756"/>
+      <w:bookmarkStart w:id="2" w:name="_Toc242821072"/>
       <w:r>
         <w:t>2. Problem ve motivasyon</w:t>
       </w:r>
@@ -1457,7 +1531,7 @@
       <w:pPr>
         <w:pStyle w:val="Balk2"/>
       </w:pPr>
-      <w:bookmarkStart w:id="3" w:name="_Toc242809757"/>
+      <w:bookmarkStart w:id="3" w:name="_Toc242821073"/>
       <w:r>
         <w:t>3. Yöntem</w:t>
       </w:r>
@@ -2891,7 +2965,7 @@
       <w:pPr>
         <w:pStyle w:val="Balk2"/>
       </w:pPr>
-      <w:bookmarkStart w:id="4" w:name="_Toc242809758"/>
+      <w:bookmarkStart w:id="4" w:name="_Toc242821074"/>
       <w:r>
         <w:lastRenderedPageBreak/>
         <w:t>4. Deney tasarımı</w:t>
@@ -3009,7 +3083,7 @@
       <w:pPr>
         <w:pStyle w:val="Balk2"/>
       </w:pPr>
-      <w:bookmarkStart w:id="5" w:name="_Toc242809759"/>
+      <w:bookmarkStart w:id="5" w:name="_Toc242821075"/>
       <w:r>
         <w:t>5. Sonuçlar</w:t>
       </w:r>
@@ -4947,7 +5021,7 @@
       <w:pPr>
         <w:pStyle w:val="Balk2"/>
       </w:pPr>
-      <w:bookmarkStart w:id="6" w:name="_Toc242809760"/>
+      <w:bookmarkStart w:id="6" w:name="_Toc242821076"/>
       <w:r>
         <w:t>6. Literatür ve yenilik değerlendirmesi</w:t>
       </w:r>
@@ -5037,7 +5111,7 @@
       <w:pPr>
         <w:pStyle w:val="Balk2"/>
       </w:pPr>
-      <w:bookmarkStart w:id="7" w:name="_Toc242809761"/>
+      <w:bookmarkStart w:id="7" w:name="_Toc242821077"/>
       <w:r>
         <w:t>7. Süreçte öğrenilenler</w:t>
       </w:r>
@@ -5162,7 +5236,7 @@
       <w:pPr>
         <w:pStyle w:val="Balk2"/>
       </w:pPr>
-      <w:bookmarkStart w:id="8" w:name="_Toc242809762"/>
+      <w:bookmarkStart w:id="8" w:name="_Toc242821078"/>
       <w:r>
         <w:t>8. Sınırlılıklar</w:t>
       </w:r>
@@ -5217,7 +5291,7 @@
       <w:pPr>
         <w:pStyle w:val="Balk2"/>
       </w:pPr>
-      <w:bookmarkStart w:id="9" w:name="_Toc242809763"/>
+      <w:bookmarkStart w:id="9" w:name="_Toc242821079"/>
       <w:r>
         <w:t>9. Olası devam yönleri</w:t>
       </w:r>
@@ -5241,7 +5315,7 @@
       <w:pPr>
         <w:pStyle w:val="Balk2"/>
       </w:pPr>
-      <w:bookmarkStart w:id="10" w:name="_Toc242809764"/>
+      <w:bookmarkStart w:id="10" w:name="_Toc242821080"/>
       <w:r>
         <w:t>10. Yeniden üretim</w:t>
       </w:r>
@@ -5694,12 +5768,47 @@
       <w:pPr>
         <w:pStyle w:val="Balk2"/>
       </w:pPr>
-      <w:bookmarkStart w:id="11" w:name="_Toc242809765"/>
+      <w:bookmarkStart w:id="11" w:name="_Toc242821081"/>
       <w:r>
         <w:lastRenderedPageBreak/>
+        <w:t>11. Yapay zekâ yardımı beyanı</w:t>
+      </w:r>
+      <w:bookmarkEnd w:id="11"/>
+    </w:p>
+    <w:p>
+      <w:r>
+        <w:t>Bu proje, Anthropic'in yapay zekâ destekli kodlama aracı Claude Code yardımıyla yürütülmüştür. Kodun yazılması, birim testleri, deney betiklerinin koşturulması ve analizi, literatür taraması, günlük (</w:t>
+      </w:r>
+      <w:r>
+        <w:rPr>
+          <w:rFonts w:ascii="Consolas" w:eastAsia="Consolas" w:hAnsi="Consolas" w:cs="Consolas"/>
+          <w:color w:val="404040"/>
+        </w:rPr>
+        <w:t>PROGRESS.md</w:t>
+      </w:r>
+      <w:r>
+        <w:t xml:space="preserve">) ve tasarım belgeleri ile bu rapor araçla birlikte hazırlanmıştır. Araştırma hedefi, her aşamaya geçiş, ön kayıtların ve sapmaların onaylanması, projenin kapatılması kararı ve sonuçların gönderilmesi yazar tarafından yapılmıştır. Raporda verilen bütün sayılar, depodaki commit'lere bağlı koşuların çıktılarından alınmıştır ve Bölüm 10'daki komutlarla yeniden üretilebilir. Literatür bilgileri web aramasıyla denetlenmiştir; doğrulanamayan künyeler </w:t>
+      </w:r>
+      <w:r>
+        <w:rPr>
+          <w:rFonts w:ascii="Consolas" w:eastAsia="Consolas" w:hAnsi="Consolas" w:cs="Consolas"/>
+          <w:color w:val="404040"/>
+        </w:rPr>
+        <w:t>RELATED_WORK.md</w:t>
+      </w:r>
+      <w:r>
+        <w:t>'de ayrıca işaretlidir.</w:t>
+      </w:r>
+    </w:p>
+    <w:p>
+      <w:pPr>
+        <w:pStyle w:val="Balk2"/>
+      </w:pPr>
+      <w:bookmarkStart w:id="12" w:name="_Toc242821082"/>
+      <w:r>
         <w:t>Kaynaklar</w:t>
       </w:r>
-      <w:bookmarkEnd w:id="11"/>
+      <w:bookmarkEnd w:id="12"/>
     </w:p>
     <w:p>
       <w:pPr>
@@ -6073,31 +6182,31 @@
       </w:rPr>
     </w:lvl>
   </w:abstractNum>
-  <w:num w:numId="1" w16cid:durableId="815143040">
+  <w:num w:numId="1" w16cid:durableId="153649000">
     <w:abstractNumId w:val="8"/>
   </w:num>
-  <w:num w:numId="2" w16cid:durableId="2084256984">
+  <w:num w:numId="2" w16cid:durableId="154271883">
     <w:abstractNumId w:val="6"/>
   </w:num>
-  <w:num w:numId="3" w16cid:durableId="1638101952">
+  <w:num w:numId="3" w16cid:durableId="970017819">
     <w:abstractNumId w:val="5"/>
   </w:num>
-  <w:num w:numId="4" w16cid:durableId="662438574">
+  <w:num w:numId="4" w16cid:durableId="86117458">
     <w:abstractNumId w:val="4"/>
   </w:num>
-  <w:num w:numId="5" w16cid:durableId="1230077291">
+  <w:num w:numId="5" w16cid:durableId="1889491619">
     <w:abstractNumId w:val="7"/>
   </w:num>
-  <w:num w:numId="6" w16cid:durableId="1420829942">
+  <w:num w:numId="6" w16cid:durableId="366685351">
     <w:abstractNumId w:val="3"/>
   </w:num>
-  <w:num w:numId="7" w16cid:durableId="1230192201">
+  <w:num w:numId="7" w16cid:durableId="905728296">
     <w:abstractNumId w:val="2"/>
   </w:num>
-  <w:num w:numId="8" w16cid:durableId="1674139492">
+  <w:num w:numId="8" w16cid:durableId="1329939824">
     <w:abstractNumId w:val="1"/>
   </w:num>
-  <w:num w:numId="9" w16cid:durableId="380861614">
+  <w:num w:numId="9" w16cid:durableId="948202266">
     <w:abstractNumId w:val="0"/>
   </w:num>
 </w:numbering>
@@ -17485,7 +17594,7 @@
     <w:autoRedefine/>
     <w:uiPriority w:val="39"/>
     <w:unhideWhenUsed/>
-    <w:rsid w:val="00EB55E9"/>
+    <w:rsid w:val="006C011B"/>
     <w:pPr>
       <w:spacing w:after="100"/>
     </w:pPr>
@@ -17497,7 +17606,7 @@
     <w:autoRedefine/>
     <w:uiPriority w:val="39"/>
     <w:unhideWhenUsed/>
-    <w:rsid w:val="00EB55E9"/>
+    <w:rsid w:val="006C011B"/>
     <w:pPr>
       <w:spacing w:after="100"/>
       <w:ind w:left="220"/>
@@ -17508,7 +17617,7 @@
     <w:basedOn w:val="VarsaylanParagrafYazTipi"/>
     <w:uiPriority w:val="99"/>
     <w:unhideWhenUsed/>
-    <w:rsid w:val="00EB55E9"/>
+    <w:rsid w:val="006C011B"/>
     <w:rPr>
       <w:color w:val="0000FF" w:themeColor="hyperlink"/>
       <w:u w:val="single"/>

</xml_diff>

<commit_message>
State that the author reviewed the closing report
TR: Raporun yazar tarafından gözden geçirildiği belirtildi.
</commit_message>
<xml_diff>
--- a/docs/kapanis_raporu.docx
+++ b/docs/kapanis_raporu.docx
@@ -35,7 +35,7 @@
       <w:pPr>
         <w:pStyle w:val="Balk1"/>
       </w:pPr>
-      <w:bookmarkStart w:id="0" w:name="_Toc242821070"/>
+      <w:bookmarkStart w:id="0" w:name="_Toc242821145"/>
       <w:r>
         <w:t>İçindekiler</w:t>
       </w:r>
@@ -66,7 +66,7 @@
       <w:r>
         <w:fldChar w:fldCharType="separate"/>
       </w:r>
-      <w:hyperlink w:anchor="_Toc242821070" w:history="1">
+      <w:hyperlink w:anchor="_Toc242821145" w:history="1">
         <w:r>
           <w:rPr>
             <w:rStyle w:val="Kpr"/>
@@ -93,7 +93,7 @@
             <w:noProof/>
             <w:webHidden/>
           </w:rPr>
-          <w:instrText xml:space="preserve"> PAGEREF _Toc242821070 \h </w:instrText>
+          <w:instrText xml:space="preserve"> PAGEREF _Toc242821145 \h </w:instrText>
         </w:r>
         <w:r>
           <w:rPr>
@@ -140,7 +140,7 @@
           <w14:ligatures w14:val="standardContextual"/>
         </w:rPr>
       </w:pPr>
-      <w:hyperlink w:anchor="_Toc242821071" w:history="1">
+      <w:hyperlink w:anchor="_Toc242821146" w:history="1">
         <w:r>
           <w:rPr>
             <w:rStyle w:val="Kpr"/>
@@ -167,7 +167,7 @@
             <w:noProof/>
             <w:webHidden/>
           </w:rPr>
-          <w:instrText xml:space="preserve"> PAGEREF _Toc242821071 \h </w:instrText>
+          <w:instrText xml:space="preserve"> PAGEREF _Toc242821146 \h </w:instrText>
         </w:r>
         <w:r>
           <w:rPr>
@@ -214,7 +214,7 @@
           <w14:ligatures w14:val="standardContextual"/>
         </w:rPr>
       </w:pPr>
-      <w:hyperlink w:anchor="_Toc242821072" w:history="1">
+      <w:hyperlink w:anchor="_Toc242821147" w:history="1">
         <w:r>
           <w:rPr>
             <w:rStyle w:val="Kpr"/>
@@ -241,7 +241,7 @@
             <w:noProof/>
             <w:webHidden/>
           </w:rPr>
-          <w:instrText xml:space="preserve"> PAGEREF _Toc242821072 \h </w:instrText>
+          <w:instrText xml:space="preserve"> PAGEREF _Toc242821147 \h </w:instrText>
         </w:r>
         <w:r>
           <w:rPr>
@@ -288,7 +288,7 @@
           <w14:ligatures w14:val="standardContextual"/>
         </w:rPr>
       </w:pPr>
-      <w:hyperlink w:anchor="_Toc242821073" w:history="1">
+      <w:hyperlink w:anchor="_Toc242821148" w:history="1">
         <w:r>
           <w:rPr>
             <w:rStyle w:val="Kpr"/>
@@ -315,7 +315,7 @@
             <w:noProof/>
             <w:webHidden/>
           </w:rPr>
-          <w:instrText xml:space="preserve"> PAGEREF _Toc242821073 \h </w:instrText>
+          <w:instrText xml:space="preserve"> PAGEREF _Toc242821148 \h </w:instrText>
         </w:r>
         <w:r>
           <w:rPr>
@@ -362,7 +362,7 @@
           <w14:ligatures w14:val="standardContextual"/>
         </w:rPr>
       </w:pPr>
-      <w:hyperlink w:anchor="_Toc242821074" w:history="1">
+      <w:hyperlink w:anchor="_Toc242821149" w:history="1">
         <w:r>
           <w:rPr>
             <w:rStyle w:val="Kpr"/>
@@ -389,7 +389,7 @@
             <w:noProof/>
             <w:webHidden/>
           </w:rPr>
-          <w:instrText xml:space="preserve"> PAGEREF _Toc242821074 \h </w:instrText>
+          <w:instrText xml:space="preserve"> PAGEREF _Toc242821149 \h </w:instrText>
         </w:r>
         <w:r>
           <w:rPr>
@@ -436,7 +436,7 @@
           <w14:ligatures w14:val="standardContextual"/>
         </w:rPr>
       </w:pPr>
-      <w:hyperlink w:anchor="_Toc242821075" w:history="1">
+      <w:hyperlink w:anchor="_Toc242821150" w:history="1">
         <w:r>
           <w:rPr>
             <w:rStyle w:val="Kpr"/>
@@ -463,7 +463,7 @@
             <w:noProof/>
             <w:webHidden/>
           </w:rPr>
-          <w:instrText xml:space="preserve"> PAGEREF _Toc242821075 \h </w:instrText>
+          <w:instrText xml:space="preserve"> PAGEREF _Toc242821150 \h </w:instrText>
         </w:r>
         <w:r>
           <w:rPr>
@@ -510,7 +510,7 @@
           <w14:ligatures w14:val="standardContextual"/>
         </w:rPr>
       </w:pPr>
-      <w:hyperlink w:anchor="_Toc242821076" w:history="1">
+      <w:hyperlink w:anchor="_Toc242821151" w:history="1">
         <w:r>
           <w:rPr>
             <w:rStyle w:val="Kpr"/>
@@ -537,7 +537,7 @@
             <w:noProof/>
             <w:webHidden/>
           </w:rPr>
-          <w:instrText xml:space="preserve"> PAGEREF _Toc242821076 \h </w:instrText>
+          <w:instrText xml:space="preserve"> PAGEREF _Toc242821151 \h </w:instrText>
         </w:r>
         <w:r>
           <w:rPr>
@@ -584,7 +584,7 @@
           <w14:ligatures w14:val="standardContextual"/>
         </w:rPr>
       </w:pPr>
-      <w:hyperlink w:anchor="_Toc242821077" w:history="1">
+      <w:hyperlink w:anchor="_Toc242821152" w:history="1">
         <w:r>
           <w:rPr>
             <w:rStyle w:val="Kpr"/>
@@ -611,7 +611,7 @@
             <w:noProof/>
             <w:webHidden/>
           </w:rPr>
-          <w:instrText xml:space="preserve"> PAGEREF _Toc242821077 \h </w:instrText>
+          <w:instrText xml:space="preserve"> PAGEREF _Toc242821152 \h </w:instrText>
         </w:r>
         <w:r>
           <w:rPr>
@@ -658,7 +658,7 @@
           <w14:ligatures w14:val="standardContextual"/>
         </w:rPr>
       </w:pPr>
-      <w:hyperlink w:anchor="_Toc242821078" w:history="1">
+      <w:hyperlink w:anchor="_Toc242821153" w:history="1">
         <w:r>
           <w:rPr>
             <w:rStyle w:val="Kpr"/>
@@ -685,7 +685,7 @@
             <w:noProof/>
             <w:webHidden/>
           </w:rPr>
-          <w:instrText xml:space="preserve"> PAGEREF _Toc242821078 \h </w:instrText>
+          <w:instrText xml:space="preserve"> PAGEREF _Toc242821153 \h </w:instrText>
         </w:r>
         <w:r>
           <w:rPr>
@@ -732,7 +732,7 @@
           <w14:ligatures w14:val="standardContextual"/>
         </w:rPr>
       </w:pPr>
-      <w:hyperlink w:anchor="_Toc242821079" w:history="1">
+      <w:hyperlink w:anchor="_Toc242821154" w:history="1">
         <w:r>
           <w:rPr>
             <w:rStyle w:val="Kpr"/>
@@ -759,7 +759,7 @@
             <w:noProof/>
             <w:webHidden/>
           </w:rPr>
-          <w:instrText xml:space="preserve"> PAGEREF _Toc242821079 \h </w:instrText>
+          <w:instrText xml:space="preserve"> PAGEREF _Toc242821154 \h </w:instrText>
         </w:r>
         <w:r>
           <w:rPr>
@@ -806,7 +806,7 @@
           <w14:ligatures w14:val="standardContextual"/>
         </w:rPr>
       </w:pPr>
-      <w:hyperlink w:anchor="_Toc242821080" w:history="1">
+      <w:hyperlink w:anchor="_Toc242821155" w:history="1">
         <w:r>
           <w:rPr>
             <w:rStyle w:val="Kpr"/>
@@ -833,7 +833,7 @@
             <w:noProof/>
             <w:webHidden/>
           </w:rPr>
-          <w:instrText xml:space="preserve"> PAGEREF _Toc242821080 \h </w:instrText>
+          <w:instrText xml:space="preserve"> PAGEREF _Toc242821155 \h </w:instrText>
         </w:r>
         <w:r>
           <w:rPr>
@@ -880,7 +880,7 @@
           <w14:ligatures w14:val="standardContextual"/>
         </w:rPr>
       </w:pPr>
-      <w:hyperlink w:anchor="_Toc242821081" w:history="1">
+      <w:hyperlink w:anchor="_Toc242821156" w:history="1">
         <w:r>
           <w:rPr>
             <w:rStyle w:val="Kpr"/>
@@ -907,7 +907,7 @@
             <w:noProof/>
             <w:webHidden/>
           </w:rPr>
-          <w:instrText xml:space="preserve"> PAGEREF _Toc242821081 \h </w:instrText>
+          <w:instrText xml:space="preserve"> PAGEREF _Toc242821156 \h </w:instrText>
         </w:r>
         <w:r>
           <w:rPr>
@@ -954,7 +954,7 @@
           <w14:ligatures w14:val="standardContextual"/>
         </w:rPr>
       </w:pPr>
-      <w:hyperlink w:anchor="_Toc242821082" w:history="1">
+      <w:hyperlink w:anchor="_Toc242821157" w:history="1">
         <w:r>
           <w:rPr>
             <w:rStyle w:val="Kpr"/>
@@ -981,7 +981,7 @@
             <w:noProof/>
             <w:webHidden/>
           </w:rPr>
-          <w:instrText xml:space="preserve"> PAGEREF _Toc242821082 \h </w:instrText>
+          <w:instrText xml:space="preserve"> PAGEREF _Toc242821157 \h </w:instrText>
         </w:r>
         <w:r>
           <w:rPr>
@@ -1026,9 +1026,8 @@
       <w:pPr>
         <w:pStyle w:val="Balk2"/>
       </w:pPr>
-      <w:bookmarkStart w:id="1" w:name="_Toc242821071"/>
-      <w:r>
-        <w:lastRenderedPageBreak/>
+      <w:bookmarkStart w:id="1" w:name="_Toc242821146"/>
+      <w:r>
         <w:t>1. Özet</w:t>
       </w:r>
       <w:bookmarkEnd w:id="1"/>
@@ -1122,7 +1121,7 @@
       <w:pPr>
         <w:pStyle w:val="Balk2"/>
       </w:pPr>
-      <w:bookmarkStart w:id="2" w:name="_Toc242821072"/>
+      <w:bookmarkStart w:id="2" w:name="_Toc242821147"/>
       <w:r>
         <w:t>2. Problem ve motivasyon</w:t>
       </w:r>
@@ -1477,7 +1476,6 @@
         <w:pStyle w:val="Balk3"/>
       </w:pPr>
       <w:r>
-        <w:lastRenderedPageBreak/>
         <w:t>2.4 Araştırma soruları</w:t>
       </w:r>
     </w:p>
@@ -1531,7 +1529,7 @@
       <w:pPr>
         <w:pStyle w:val="Balk2"/>
       </w:pPr>
-      <w:bookmarkStart w:id="3" w:name="_Toc242821073"/>
+      <w:bookmarkStart w:id="3" w:name="_Toc242821148"/>
       <w:r>
         <w:t>3. Yöntem</w:t>
       </w:r>
@@ -2042,7 +2040,6 @@
         <w:pStyle w:val="Balk3"/>
       </w:pPr>
       <w:r>
-        <w:lastRenderedPageBreak/>
         <w:t>3.3 Sert açılabilirlik katmanı</w:t>
       </w:r>
     </w:p>
@@ -2965,9 +2962,8 @@
       <w:pPr>
         <w:pStyle w:val="Balk2"/>
       </w:pPr>
-      <w:bookmarkStart w:id="4" w:name="_Toc242821074"/>
-      <w:r>
-        <w:lastRenderedPageBreak/>
+      <w:bookmarkStart w:id="4" w:name="_Toc242821149"/>
+      <w:r>
         <w:t>4. Deney tasarımı</w:t>
       </w:r>
       <w:bookmarkEnd w:id="4"/>
@@ -3083,7 +3079,7 @@
       <w:pPr>
         <w:pStyle w:val="Balk2"/>
       </w:pPr>
-      <w:bookmarkStart w:id="5" w:name="_Toc242821075"/>
+      <w:bookmarkStart w:id="5" w:name="_Toc242821150"/>
       <w:r>
         <w:t>5. Sonuçlar</w:t>
       </w:r>
@@ -3634,7 +3630,6 @@
         <w:pStyle w:val="Balk3"/>
       </w:pPr>
       <w:r>
-        <w:lastRenderedPageBreak/>
         <w:t>5.2 Aşama 1a: hazırlık ve iki önemli bulgu</w:t>
       </w:r>
     </w:p>
@@ -4713,7 +4708,6 @@
         <w:pStyle w:val="Balk3"/>
       </w:pPr>
       <w:r>
-        <w:lastRenderedPageBreak/>
         <w:t>5.4 Keşif amaçlı analizler</w:t>
       </w:r>
     </w:p>
@@ -5021,7 +5015,7 @@
       <w:pPr>
         <w:pStyle w:val="Balk2"/>
       </w:pPr>
-      <w:bookmarkStart w:id="6" w:name="_Toc242821076"/>
+      <w:bookmarkStart w:id="6" w:name="_Toc242821151"/>
       <w:r>
         <w:t>6. Literatür ve yenilik değerlendirmesi</w:t>
       </w:r>
@@ -5111,7 +5105,7 @@
       <w:pPr>
         <w:pStyle w:val="Balk2"/>
       </w:pPr>
-      <w:bookmarkStart w:id="7" w:name="_Toc242821077"/>
+      <w:bookmarkStart w:id="7" w:name="_Toc242821152"/>
       <w:r>
         <w:t>7. Süreçte öğrenilenler</w:t>
       </w:r>
@@ -5159,7 +5153,6 @@
         <w:ind w:left="357" w:hanging="283"/>
       </w:pPr>
       <w:r>
-        <w:lastRenderedPageBreak/>
         <w:t xml:space="preserve">3. </w:t>
       </w:r>
       <w:r>
@@ -5236,7 +5229,7 @@
       <w:pPr>
         <w:pStyle w:val="Balk2"/>
       </w:pPr>
-      <w:bookmarkStart w:id="8" w:name="_Toc242821078"/>
+      <w:bookmarkStart w:id="8" w:name="_Toc242821153"/>
       <w:r>
         <w:t>8. Sınırlılıklar</w:t>
       </w:r>
@@ -5291,7 +5284,7 @@
       <w:pPr>
         <w:pStyle w:val="Balk2"/>
       </w:pPr>
-      <w:bookmarkStart w:id="9" w:name="_Toc242821079"/>
+      <w:bookmarkStart w:id="9" w:name="_Toc242821154"/>
       <w:r>
         <w:t>9. Olası devam yönleri</w:t>
       </w:r>
@@ -5315,7 +5308,7 @@
       <w:pPr>
         <w:pStyle w:val="Balk2"/>
       </w:pPr>
-      <w:bookmarkStart w:id="10" w:name="_Toc242821080"/>
+      <w:bookmarkStart w:id="10" w:name="_Toc242821155"/>
       <w:r>
         <w:t>10. Yeniden üretim</w:t>
       </w:r>
@@ -5768,9 +5761,8 @@
       <w:pPr>
         <w:pStyle w:val="Balk2"/>
       </w:pPr>
-      <w:bookmarkStart w:id="11" w:name="_Toc242821081"/>
-      <w:r>
-        <w:lastRenderedPageBreak/>
+      <w:bookmarkStart w:id="11" w:name="_Toc242821156"/>
+      <w:r>
         <w:t>11. Yapay zekâ yardımı beyanı</w:t>
       </w:r>
       <w:bookmarkEnd w:id="11"/>
@@ -5797,14 +5789,14 @@
         <w:t>RELATED_WORK.md</w:t>
       </w:r>
       <w:r>
-        <w:t>'de ayrıca işaretlidir.</w:t>
+        <w:t>'de ayrıca işaretlidir. Rapor, yazar tarafından okunmuş ve gözden geçirilmiştir.</w:t>
       </w:r>
     </w:p>
     <w:p>
       <w:pPr>
         <w:pStyle w:val="Balk2"/>
       </w:pPr>
-      <w:bookmarkStart w:id="12" w:name="_Toc242821082"/>
+      <w:bookmarkStart w:id="12" w:name="_Toc242821157"/>
       <w:r>
         <w:t>Kaynaklar</w:t>
       </w:r>
@@ -6182,31 +6174,31 @@
       </w:rPr>
     </w:lvl>
   </w:abstractNum>
-  <w:num w:numId="1" w16cid:durableId="153649000">
+  <w:num w:numId="1" w16cid:durableId="1689064240">
     <w:abstractNumId w:val="8"/>
   </w:num>
-  <w:num w:numId="2" w16cid:durableId="154271883">
+  <w:num w:numId="2" w16cid:durableId="1141849691">
     <w:abstractNumId w:val="6"/>
   </w:num>
-  <w:num w:numId="3" w16cid:durableId="970017819">
+  <w:num w:numId="3" w16cid:durableId="1188980493">
     <w:abstractNumId w:val="5"/>
   </w:num>
-  <w:num w:numId="4" w16cid:durableId="86117458">
+  <w:num w:numId="4" w16cid:durableId="1394352408">
     <w:abstractNumId w:val="4"/>
   </w:num>
-  <w:num w:numId="5" w16cid:durableId="1889491619">
+  <w:num w:numId="5" w16cid:durableId="152183836">
     <w:abstractNumId w:val="7"/>
   </w:num>
-  <w:num w:numId="6" w16cid:durableId="366685351">
+  <w:num w:numId="6" w16cid:durableId="806320532">
     <w:abstractNumId w:val="3"/>
   </w:num>
-  <w:num w:numId="7" w16cid:durableId="905728296">
+  <w:num w:numId="7" w16cid:durableId="485362600">
     <w:abstractNumId w:val="2"/>
   </w:num>
-  <w:num w:numId="8" w16cid:durableId="1329939824">
+  <w:num w:numId="8" w16cid:durableId="1467897181">
     <w:abstractNumId w:val="1"/>
   </w:num>
-  <w:num w:numId="9" w16cid:durableId="948202266">
+  <w:num w:numId="9" w16cid:durableId="1074939461">
     <w:abstractNumId w:val="0"/>
   </w:num>
 </w:numbering>
@@ -17594,7 +17586,7 @@
     <w:autoRedefine/>
     <w:uiPriority w:val="39"/>
     <w:unhideWhenUsed/>
-    <w:rsid w:val="006C011B"/>
+    <w:rsid w:val="0071670E"/>
     <w:pPr>
       <w:spacing w:after="100"/>
     </w:pPr>
@@ -17606,7 +17598,7 @@
     <w:autoRedefine/>
     <w:uiPriority w:val="39"/>
     <w:unhideWhenUsed/>
-    <w:rsid w:val="006C011B"/>
+    <w:rsid w:val="0071670E"/>
     <w:pPr>
       <w:spacing w:after="100"/>
       <w:ind w:left="220"/>
@@ -17617,7 +17609,7 @@
     <w:basedOn w:val="VarsaylanParagrafYazTipi"/>
     <w:uiPriority w:val="99"/>
     <w:unhideWhenUsed/>
-    <w:rsid w:val="006C011B"/>
+    <w:rsid w:val="0071670E"/>
     <w:rPr>
       <w:color w:val="0000FF" w:themeColor="hyperlink"/>
       <w:u w:val="single"/>

</xml_diff>